<commit_message>
Add task PDFs and repository QR codes to practice report
</commit_message>
<xml_diff>
--- a/docs/Отчет по практике.docx
+++ b/docs/Отчет по практике.docx
@@ -1051,6 +1051,7 @@
     </w:p>
     <w:p>
       <w:pPr>
+        <w:keepNext/>
         <w:pBdr>
           <w:top w:val="nil"/>
           <w:left w:val="nil"/>
@@ -1091,22 +1092,49 @@
           <w:right w:val="nil"/>
           <w:between w:val="nil"/>
         </w:pBdr>
-        <w:spacing w:after="0" w:line="240" w:lineRule="auto"/>
-        <w:rPr>
-          <w:rFonts w:ascii="Times New Roman" w:eastAsia="Times New Roman" w:hAnsi="Times New Roman" w:cs="Times New Roman"/>
-          <w:color w:val="000000"/>
-          <w:sz w:val="24"/>
-          <w:szCs w:val="24"/>
-        </w:rPr>
-      </w:pPr>
-      <w:r>
-        <w:rPr>
-          <w:rFonts w:ascii="Times New Roman" w:eastAsia="Times New Roman" w:hAnsi="Times New Roman" w:cs="Times New Roman"/>
-          <w:color w:val="000000"/>
-          <w:sz w:val="24"/>
-          <w:szCs w:val="24"/>
-        </w:rPr>
-        <w:br/>
+        <w:spacing w:after="160" w:line="240" w:lineRule="auto" w:before="0"/>
+        <w:ind w:firstLine="0"/>
+        <w:jc w:val="left"/>
+        <w:rPr>
+          <w:rFonts w:ascii="Times New Roman" w:eastAsia="Times New Roman" w:hAnsi="Times New Roman" w:cs="Times New Roman"/>
+          <w:color w:val="000000"/>
+          <w:sz w:val="24"/>
+          <w:szCs w:val="24"/>
+        </w:rPr>
+      </w:pPr>
+      <w:r>
+        <w:drawing>
+          <wp:inline xmlns:a="http://schemas.openxmlformats.org/drawingml/2006/main" xmlns:pic="http://schemas.openxmlformats.org/drawingml/2006/picture">
+            <wp:extent cx="864000" cy="864000"/>
+            <wp:docPr id="4" name="Picture 4" descr="QR-код репозитория: https://github.com/LyoshaGodX/mag-practice-26-winter"/>
+            <wp:cNvGraphicFramePr>
+              <a:graphicFrameLocks noChangeAspect="1"/>
+            </wp:cNvGraphicFramePr>
+            <a:graphic>
+              <a:graphicData uri="http://schemas.openxmlformats.org/drawingml/2006/picture">
+                <pic:pic>
+                  <pic:nvPicPr>
+                    <pic:cNvPr id="0" name="repo-qr.png"/>
+                    <pic:cNvPicPr/>
+                  </pic:nvPicPr>
+                  <pic:blipFill>
+                    <a:blip r:embed="rId6"/>
+                    <a:stretch>
+                      <a:fillRect/>
+                    </a:stretch>
+                  </pic:blipFill>
+                  <pic:spPr>
+                    <a:xfrm>
+                      <a:off x="0" y="0"/>
+                      <a:ext cx="864000" cy="864000"/>
+                    </a:xfrm>
+                    <a:prstGeom prst="rect"/>
+                  </pic:spPr>
+                </pic:pic>
+              </a:graphicData>
+            </a:graphic>
+          </wp:inline>
+        </w:drawing>
       </w:r>
     </w:p>
     <w:p>
@@ -1303,6 +1331,7 @@
     </w:p>
     <w:p>
       <w:pPr>
+        <w:keepNext/>
         <w:pBdr>
           <w:top w:val="nil"/>
           <w:left w:val="nil"/>
@@ -1336,34 +1365,54 @@
     </w:p>
     <w:p>
       <w:pPr>
+        <w:spacing w:before="0" w:after="160" w:line="240" w:lineRule="auto"/>
+        <w:ind w:firstLine="0"/>
+        <w:jc w:val="left"/>
         <w:rPr>
           <w:rFonts w:ascii="Times" w:eastAsia="Times" w:hAnsi="Times" w:cs="Times"/>
           <w:sz w:val="20"/>
           <w:szCs w:val="20"/>
         </w:rPr>
       </w:pPr>
-    </w:p>
-    <w:p>
-      <w:pPr>
-        <w:rPr>
-          <w:rFonts w:ascii="Times" w:eastAsia="Times" w:hAnsi="Times" w:cs="Times"/>
-          <w:sz w:val="20"/>
-          <w:szCs w:val="20"/>
-        </w:rPr>
-      </w:pPr>
-    </w:p>
-    <w:p>
-      <w:pPr>
-        <w:rPr>
-          <w:rFonts w:ascii="Times" w:eastAsia="Times" w:hAnsi="Times" w:cs="Times"/>
-          <w:sz w:val="20"/>
-          <w:szCs w:val="20"/>
-        </w:rPr>
-      </w:pPr>
+      <w:r>
+        <w:drawing>
+          <wp:inline xmlns:a="http://schemas.openxmlformats.org/drawingml/2006/main" xmlns:pic="http://schemas.openxmlformats.org/drawingml/2006/picture">
+            <wp:extent cx="864000" cy="864000"/>
+            <wp:docPr id="5" name="Picture 5" descr="QR-код репозитория: https://github.com/LyoshaGodX/mag-practice-26-winter"/>
+            <wp:cNvGraphicFramePr>
+              <a:graphicFrameLocks noChangeAspect="1"/>
+            </wp:cNvGraphicFramePr>
+            <a:graphic>
+              <a:graphicData uri="http://schemas.openxmlformats.org/drawingml/2006/picture">
+                <pic:pic>
+                  <pic:nvPicPr>
+                    <pic:cNvPr id="0" name="repo-qr.png"/>
+                    <pic:cNvPicPr/>
+                  </pic:nvPicPr>
+                  <pic:blipFill>
+                    <a:blip r:embed="rId6"/>
+                    <a:stretch>
+                      <a:fillRect/>
+                    </a:stretch>
+                  </pic:blipFill>
+                  <pic:spPr>
+                    <a:xfrm>
+                      <a:off x="0" y="0"/>
+                      <a:ext cx="864000" cy="864000"/>
+                    </a:xfrm>
+                    <a:prstGeom prst="rect"/>
+                  </pic:spPr>
+                </pic:pic>
+              </a:graphicData>
+            </a:graphic>
+          </wp:inline>
+        </w:drawing>
+      </w:r>
     </w:p>
     <w:p>
       <w:pPr>
         <w:pStyle w:val="1"/>
+        <w:pageBreakBefore/>
         <w:jc w:val="center"/>
       </w:pPr>
       <w:r>
@@ -1552,6 +1601,7 @@
     </w:p>
     <w:p>
       <w:pPr>
+        <w:keepNext/>
         <w:spacing w:after="0" w:line="240" w:lineRule="auto"/>
         <w:rPr>
           <w:rFonts w:ascii="Times New Roman" w:eastAsia="Times New Roman" w:hAnsi="Times New Roman" w:cs="Times New Roman"/>
@@ -1577,64 +1627,49 @@
     </w:p>
     <w:p>
       <w:pPr>
-        <w:spacing w:after="0" w:line="240" w:lineRule="auto"/>
+        <w:spacing w:after="160" w:line="240" w:lineRule="auto" w:before="0"/>
+        <w:ind w:firstLine="0"/>
+        <w:jc w:val="left"/>
         <w:rPr>
           <w:rFonts w:ascii="Times" w:eastAsia="Times" w:hAnsi="Times" w:cs="Times"/>
           <w:sz w:val="20"/>
           <w:szCs w:val="20"/>
         </w:rPr>
       </w:pPr>
-    </w:p>
-    <w:p>
-      <w:pPr>
-        <w:spacing w:after="0" w:line="240" w:lineRule="auto"/>
-        <w:rPr>
-          <w:rFonts w:ascii="Times" w:eastAsia="Times" w:hAnsi="Times" w:cs="Times"/>
-          <w:sz w:val="20"/>
-          <w:szCs w:val="20"/>
-        </w:rPr>
-      </w:pPr>
-    </w:p>
-    <w:p>
-      <w:pPr>
-        <w:pBdr>
-          <w:top w:val="nil"/>
-          <w:left w:val="nil"/>
-          <w:bottom w:val="nil"/>
-          <w:right w:val="nil"/>
-          <w:between w:val="nil"/>
-        </w:pBdr>
-        <w:spacing w:after="0"/>
-        <w:ind w:left="-851" w:firstLine="851"/>
-        <w:rPr>
-          <w:rFonts w:ascii="Times New Roman" w:eastAsia="Times New Roman" w:hAnsi="Times New Roman" w:cs="Times New Roman"/>
-          <w:i/>
-          <w:iCs/>
-          <w:sz w:val="24"/>
-          <w:szCs w:val="24"/>
-        </w:rPr>
-      </w:pPr>
-    </w:p>
-    <w:p>
-      <w:pPr>
-        <w:pBdr>
-          <w:top w:val="nil"/>
-          <w:left w:val="nil"/>
-          <w:bottom w:val="nil"/>
-          <w:right w:val="nil"/>
-          <w:between w:val="nil"/>
-        </w:pBdr>
-        <w:spacing w:after="0"/>
-        <w:ind w:left="-851" w:firstLine="851"/>
-        <w:rPr>
-          <w:rFonts w:ascii="Times New Roman" w:eastAsia="Times New Roman" w:hAnsi="Times New Roman" w:cs="Times New Roman"/>
-          <w:i/>
-          <w:iCs/>
-          <w:color w:val="000000"/>
-          <w:sz w:val="24"/>
-          <w:szCs w:val="24"/>
-        </w:rPr>
-      </w:pPr>
+      <w:r>
+        <w:drawing>
+          <wp:inline xmlns:a="http://schemas.openxmlformats.org/drawingml/2006/main" xmlns:pic="http://schemas.openxmlformats.org/drawingml/2006/picture">
+            <wp:extent cx="864000" cy="864000"/>
+            <wp:docPr id="6" name="Picture 6" descr="QR-код репозитория: https://github.com/LyoshaGodX/mag-practice-26-winter"/>
+            <wp:cNvGraphicFramePr>
+              <a:graphicFrameLocks noChangeAspect="1"/>
+            </wp:cNvGraphicFramePr>
+            <a:graphic>
+              <a:graphicData uri="http://schemas.openxmlformats.org/drawingml/2006/picture">
+                <pic:pic>
+                  <pic:nvPicPr>
+                    <pic:cNvPr id="0" name="repo-qr.png"/>
+                    <pic:cNvPicPr/>
+                  </pic:nvPicPr>
+                  <pic:blipFill>
+                    <a:blip r:embed="rId6"/>
+                    <a:stretch>
+                      <a:fillRect/>
+                    </a:stretch>
+                  </pic:blipFill>
+                  <pic:spPr>
+                    <a:xfrm>
+                      <a:off x="0" y="0"/>
+                      <a:ext cx="864000" cy="864000"/>
+                    </a:xfrm>
+                    <a:prstGeom prst="rect"/>
+                  </pic:spPr>
+                </pic:pic>
+              </a:graphicData>
+            </a:graphic>
+          </wp:inline>
+        </w:drawing>
+      </w:r>
     </w:p>
     <w:p>
       <w:pPr>
@@ -1768,6 +1803,7 @@
     </w:p>
     <w:p>
       <w:pPr>
+        <w:keepNext/>
         <w:pBdr>
           <w:top w:val="nil"/>
           <w:left w:val="nil"/>
@@ -1801,34 +1837,51 @@
     </w:p>
     <w:p>
       <w:pPr>
-        <w:spacing w:after="0" w:line="240" w:lineRule="auto"/>
-        <w:rPr>
-          <w:rFonts w:ascii="Times New Roman" w:eastAsia="Times New Roman" w:hAnsi="Times New Roman" w:cs="Times New Roman"/>
-          <w:color w:val="000000"/>
-          <w:sz w:val="24"/>
-          <w:szCs w:val="24"/>
-        </w:rPr>
-      </w:pPr>
-    </w:p>
-    <w:p>
-      <w:pPr>
-        <w:spacing w:after="0" w:line="240" w:lineRule="auto"/>
-        <w:jc w:val="both"/>
-        <w:rPr>
-          <w:rFonts w:ascii="Times New Roman" w:eastAsia="Times New Roman" w:hAnsi="Times New Roman" w:cs="Times New Roman"/>
-          <w:color w:val="000000"/>
-          <w:sz w:val="24"/>
-          <w:szCs w:val="24"/>
-        </w:rPr>
-      </w:pPr>
-    </w:p>
-    <w:p/>
-    <w:p/>
-    <w:p/>
-    <w:p/>
-    <w:p/>
-    <w:p/>
-    <w:p/>
+        <w:spacing w:after="160" w:line="240" w:lineRule="auto" w:before="0"/>
+        <w:ind w:firstLine="0"/>
+        <w:jc w:val="left"/>
+        <w:rPr>
+          <w:rFonts w:ascii="Times New Roman" w:eastAsia="Times New Roman" w:hAnsi="Times New Roman" w:cs="Times New Roman"/>
+          <w:color w:val="000000"/>
+          <w:sz w:val="24"/>
+          <w:szCs w:val="24"/>
+        </w:rPr>
+      </w:pPr>
+      <w:r>
+        <w:drawing>
+          <wp:inline xmlns:a="http://schemas.openxmlformats.org/drawingml/2006/main" xmlns:pic="http://schemas.openxmlformats.org/drawingml/2006/picture">
+            <wp:extent cx="864000" cy="864000"/>
+            <wp:docPr id="7" name="Picture 7" descr="QR-код репозитория: https://github.com/LyoshaGodX/mag-practice-26-winter"/>
+            <wp:cNvGraphicFramePr>
+              <a:graphicFrameLocks noChangeAspect="1"/>
+            </wp:cNvGraphicFramePr>
+            <a:graphic>
+              <a:graphicData uri="http://schemas.openxmlformats.org/drawingml/2006/picture">
+                <pic:pic>
+                  <pic:nvPicPr>
+                    <pic:cNvPr id="0" name="repo-qr.png"/>
+                    <pic:cNvPicPr/>
+                  </pic:nvPicPr>
+                  <pic:blipFill>
+                    <a:blip r:embed="rId6"/>
+                    <a:stretch>
+                      <a:fillRect/>
+                    </a:stretch>
+                  </pic:blipFill>
+                  <pic:spPr>
+                    <a:xfrm>
+                      <a:off x="0" y="0"/>
+                      <a:ext cx="864000" cy="864000"/>
+                    </a:xfrm>
+                    <a:prstGeom prst="rect"/>
+                  </pic:spPr>
+                </pic:pic>
+              </a:graphicData>
+            </a:graphic>
+          </wp:inline>
+        </w:drawing>
+      </w:r>
+    </w:p>
     <w:p>
       <w:pPr>
         <w:tabs>
@@ -1846,7 +1899,7 @@
           <w:tab w:val="left" w:pos="8496"/>
           <w:tab w:val="left" w:pos="9204"/>
         </w:tabs>
-        <w:spacing w:after="0" w:line="240" w:lineRule="auto"/>
+        <w:spacing w:after="0" w:line="240" w:lineRule="auto" w:before="360"/>
         <w:jc w:val="both"/>
         <w:rPr>
           <w:rFonts w:ascii="Times New Roman" w:eastAsia="Times New Roman" w:hAnsi="Times New Roman" w:cs="Times New Roman"/>

</xml_diff>